<commit_message>
docs(ilm): regenerate rendered + docx after sub-status approval change
Co-Authored-By: Claude Opus 4.8 <noreply@anthropic.com>
Claude-Session: https://claude.ai/code/session_01RwtMRFwzHC7G5CTnGLhgKu
</commit_message>
<xml_diff>
--- a/docs/as-built/docx/ilm.docx
+++ b/docs/as-built/docx/ilm.docx
@@ -633,7 +633,7 @@
               <a:graphicData uri="http://schemas.openxmlformats.org/drawingml/2006/picture">
                 <pic:pic>
                   <pic:nvPicPr>
-                    <pic:cNvPr descr="/tmp/docximg-dY8fbM/ilm_md_1.png" id="23" name="Picture"/>
+                    <pic:cNvPr descr="/tmp/docximg-qjBMyN/ilm_md_1.png" id="23" name="Picture"/>
                     <pic:cNvPicPr>
                       <a:picLocks noChangeArrowheads="1" noChangeAspect="1"/>
                     </pic:cNvPicPr>
@@ -737,13 +737,29 @@
         <w:t xml:space="preserve"> </w:t>
       </w:r>
       <w:r>
-        <w:t xml:space="preserve">INACTIVE) and whether the change needs approval. "Hold" needs approval, so the change is rejected unless</w:t>
-      </w:r>
-      <w:r>
-        <w:t xml:space="preserve"> </w:t>
-      </w:r>
-      <w:r>
-        <w:t xml:space="preserve">an approval reference is supplied.</w:t>
+        <w:t xml:space="preserve">INACTIVE) and whether the change needs approval. "Hold" needs approval, so the change is</w:t>
+      </w:r>
+      <w:r>
+        <w:t xml:space="preserve"> </w:t>
+      </w:r>
+      <w:r>
+        <w:rPr>
+          <w:bCs/>
+          <w:b/>
+        </w:rPr>
+        <w:t xml:space="preserve">held</w:t>
+      </w:r>
+      <w:r>
+        <w:t xml:space="preserve"> </w:t>
+      </w:r>
+      <w:r>
+        <w:t xml:space="preserve">until a</w:t>
+      </w:r>
+      <w:r>
+        <w:t xml:space="preserve"> </w:t>
+      </w:r>
+      <w:r>
+        <w:t xml:space="preserve">back-office approver signs off — and that approval can be a single sign-off or a chain.</w:t>
       </w:r>
     </w:p>
     <w:p>
@@ -803,7 +819,7 @@
         <w:t xml:space="preserve"> </w:t>
       </w:r>
       <w:r>
-        <w:t xml:space="preserve">validates the code,</w:t>
+        <w:t xml:space="preserve">validates the code and</w:t>
       </w:r>
       <w:r>
         <w:t xml:space="preserve"> </w:t>
@@ -828,7 +844,7 @@
         <w:t xml:space="preserve"> </w:t>
       </w:r>
       <w:r>
-        <w:t xml:space="preserve">(clone), and because</w:t>
+        <w:t xml:space="preserve">(clone). Because</w:t>
       </w:r>
       <w:r>
         <w:t xml:space="preserve"> </w:t>
@@ -840,31 +856,111 @@
         <w:t xml:space="preserve">requires_approval=true</w:t>
       </w:r>
       <w:r>
-        <w:t xml:space="preserve"> </w:t>
-      </w:r>
-      <w:r>
-        <w:t xml:space="preserve">it rejects without an</w:t>
-      </w:r>
-      <w:r>
-        <w:t xml:space="preserve"> </w:t>
-      </w:r>
-      <w:r>
-        <w:rPr>
-          <w:rStyle w:val="VerbatimChar"/>
-        </w:rPr>
-        <w:t xml:space="preserve">approval_reference</w:t>
-      </w:r>
-      <w:r>
-        <w:t xml:space="preserve"> </w:t>
-      </w:r>
-      <w:r>
-        <w:t xml:space="preserve">(R-ILM-S-2). With one it commits,</w:t>
-      </w:r>
-      <w:r>
-        <w:t xml:space="preserve"> </w:t>
-      </w:r>
-      <w:r>
-        <w:t xml:space="preserve">writes</w:t>
+        <w:t xml:space="preserve">, it</w:t>
+      </w:r>
+      <w:r>
+        <w:t xml:space="preserve"> </w:t>
+      </w:r>
+      <w:r>
+        <w:rPr>
+          <w:bCs/>
+          <w:b/>
+        </w:rPr>
+        <w:t xml:space="preserve">routes through EM-CFG-04</w:t>
+      </w:r>
+      <w:r>
+        <w:t xml:space="preserve"> </w:t>
+      </w:r>
+      <w:r>
+        <w:t xml:space="preserve">— raises an</w:t>
+      </w:r>
+      <w:r>
+        <w:t xml:space="preserve"> </w:t>
+      </w:r>
+      <w:r>
+        <w:rPr>
+          <w:rStyle w:val="VerbatimChar"/>
+        </w:rPr>
+        <w:t xml:space="preserve">ApprovalService::request</w:t>
+      </w:r>
+      <w:r>
+        <w:t xml:space="preserve"> </w:t>
+      </w:r>
+      <w:r>
+        <w:t xml:space="preserve">(</w:t>
+      </w:r>
+      <w:r>
+        <w:rPr>
+          <w:rStyle w:val="VerbatimChar"/>
+        </w:rPr>
+        <w:t xml:space="preserve">entity_type=CUSTOMER_SUB_STATUS</w:t>
+      </w:r>
+      <w:r>
+        <w:t xml:space="preserve">,</w:t>
+      </w:r>
+      <w:r>
+        <w:t xml:space="preserve"> </w:t>
+      </w:r>
+      <w:r>
+        <w:rPr>
+          <w:rStyle w:val="VerbatimChar"/>
+        </w:rPr>
+        <w:t xml:space="preserve">action=hold</w:t>
+      </w:r>
+      <w:r>
+        <w:t xml:space="preserve">) and returns the account</w:t>
+      </w:r>
+      <w:r>
+        <w:t xml:space="preserve"> </w:t>
+      </w:r>
+      <w:r>
+        <w:rPr>
+          <w:bCs/>
+          <w:b/>
+        </w:rPr>
+        <w:t xml:space="preserve">unchanged</w:t>
+      </w:r>
+      <w:r>
+        <w:t xml:space="preserve"> </w:t>
+      </w:r>
+      <w:r>
+        <w:t xml:space="preserve">(held PENDING).</w:t>
+      </w:r>
+      <w:r>
+        <w:t xml:space="preserve"> </w:t>
+      </w:r>
+      <w:r>
+        <w:t xml:space="preserve">When an approver (a single</w:t>
+      </w:r>
+      <w:r>
+        <w:t xml:space="preserve"> </w:t>
+      </w:r>
+      <w:r>
+        <w:rPr>
+          <w:rStyle w:val="VerbatimChar"/>
+        </w:rPr>
+        <w:t xml:space="preserve">CUSTOMER_CARE_SUPERVISOR</w:t>
+      </w:r>
+      <w:r>
+        <w:t xml:space="preserve"> </w:t>
+      </w:r>
+      <w:r>
+        <w:t xml:space="preserve">by default, or each stage of a chain) approves,</w:t>
+      </w:r>
+      <w:r>
+        <w:t xml:space="preserve"> </w:t>
+      </w:r>
+      <w:r>
+        <w:rPr>
+          <w:rStyle w:val="VerbatimChar"/>
+        </w:rPr>
+        <w:t xml:space="preserve">ApplySubStatusOnApproval</w:t>
+      </w:r>
+      <w:r>
+        <w:t xml:space="preserve"> </w:t>
+      </w:r>
+      <w:r>
+        <w:t xml:space="preserve">applies the transition, writes</w:t>
       </w:r>
       <w:r>
         <w:t xml:space="preserve"> </w:t>
@@ -913,7 +1009,7 @@
           <w:iCs/>
           <w:i/>
         </w:rPr>
-        <w:t xml:space="preserve">AccountFlagTest</w:t>
+        <w:t xml:space="preserve">AccountFlagTest::test_sub_status_requiring_approval_routes_through_em_cfg_04</w:t>
       </w:r>
       <w:r>
         <w:rPr>
@@ -1417,7 +1513,7 @@
               <a:graphicData uri="http://schemas.openxmlformats.org/drawingml/2006/picture">
                 <pic:pic>
                   <pic:nvPicPr>
-                    <pic:cNvPr descr="/tmp/docximg-dY8fbM/ilm_md_2.png" id="30" name="Picture"/>
+                    <pic:cNvPr descr="/tmp/docximg-qjBMyN/ilm_md_2.png" id="30" name="Picture"/>
                     <pic:cNvPicPr>
                       <a:picLocks noChangeArrowheads="1" noChangeAspect="1"/>
                     </pic:cNvPicPr>
@@ -1991,7 +2087,7 @@
               <a:graphicData uri="http://schemas.openxmlformats.org/drawingml/2006/picture">
                 <pic:pic>
                   <pic:nvPicPr>
-                    <pic:cNvPr descr="/tmp/docximg-dY8fbM/ilm_md_3.png" id="35" name="Picture"/>
+                    <pic:cNvPr descr="/tmp/docximg-qjBMyN/ilm_md_3.png" id="35" name="Picture"/>
                     <pic:cNvPicPr>
                       <a:picLocks noChangeArrowheads="1" noChangeAspect="1"/>
                     </pic:cNvPicPr>
@@ -11615,7 +11711,23 @@
               <w:t xml:space="preserve">requires_approval=true</w:t>
             </w:r>
             <w:r>
-              <w:t xml:space="preserve">) from an Account Manager or Region Head (</w:t>
+              <w:t xml:space="preserve">) — the transition is</w:t>
+            </w:r>
+            <w:r>
+              <w:t xml:space="preserve"> </w:t>
+            </w:r>
+            <w:r>
+              <w:rPr>
+                <w:bCs/>
+                <w:b/>
+              </w:rPr>
+              <w:t xml:space="preserve">held until an EM-CFG-04 approval clears</w:t>
+            </w:r>
+            <w:r>
+              <w:t xml:space="preserve"> </w:t>
+            </w:r>
+            <w:r>
+              <w:t xml:space="preserve">(</w:t>
             </w:r>
             <w:r>
               <w:rPr>
@@ -11624,7 +11736,10 @@
               <w:t xml:space="preserve">approval_roles_jsonb</w:t>
             </w:r>
             <w:r>
-              <w:t xml:space="preserve">).</w:t>
+              <w:t xml:space="preserve"> </w:t>
+            </w:r>
+            <w:r>
+              <w:t xml:space="preserve">is the advisory role list).</w:t>
             </w:r>
           </w:p>
         </w:tc>
@@ -11666,7 +11781,7 @@
               <w:t xml:space="preserve">INACTIVE</w:t>
             </w:r>
             <w:r>
-              <w:t xml:space="preserve">, needs a Back-Office Supervisor's approval, and</w:t>
+              <w:t xml:space="preserve">, needs approval, and</w:t>
             </w:r>
             <w:r>
               <w:t xml:space="preserve"> </w:t>
@@ -11750,7 +11865,77 @@
     </w:tbl>
     <w:p>
       <w:pPr>
-        <w:pStyle w:val="BodyText"/>
+        <w:pStyle w:val="BlockText"/>
+      </w:pPr>
+      <w:r>
+        <w:rPr>
+          <w:iCs/>
+          <w:i/>
+        </w:rPr>
+        <w:t xml:space="preserve">(The</w:t>
+      </w:r>
+      <w:r>
+        <w:rPr>
+          <w:iCs/>
+          <w:i/>
+        </w:rPr>
+        <w:t xml:space="preserve"> </w:t>
+      </w:r>
+      <w:r>
+        <w:rPr>
+          <w:rStyle w:val="VerbatimChar"/>
+          <w:iCs/>
+          <w:i/>
+        </w:rPr>
+        <w:t xml:space="preserve">approval_roles_jsonb</w:t>
+      </w:r>
+      <w:r>
+        <w:rPr>
+          <w:iCs/>
+          <w:i/>
+        </w:rPr>
+        <w:t xml:space="preserve"> </w:t>
+      </w:r>
+      <w:r>
+        <w:rPr>
+          <w:iCs/>
+          <w:i/>
+        </w:rPr>
+        <w:t xml:space="preserve">role names above are illustrative — the seeded rows leave it null; the seeded EM-CFG-04 policy defaults to a single</w:t>
+      </w:r>
+      <w:r>
+        <w:rPr>
+          <w:iCs/>
+          <w:i/>
+        </w:rPr>
+        <w:t xml:space="preserve"> </w:t>
+      </w:r>
+      <w:r>
+        <w:rPr>
+          <w:rStyle w:val="VerbatimChar"/>
+          <w:iCs/>
+          <w:i/>
+        </w:rPr>
+        <w:t xml:space="preserve">CUSTOMER_CARE_SUPERVISOR</w:t>
+      </w:r>
+      <w:r>
+        <w:rPr>
+          <w:iCs/>
+          <w:i/>
+        </w:rPr>
+        <w:t xml:space="preserve"> </w:t>
+      </w:r>
+      <w:r>
+        <w:rPr>
+          <w:iCs/>
+          <w:i/>
+        </w:rPr>
+        <w:t xml:space="preserve">stage.)</w:t>
+      </w:r>
+    </w:p>
+    <w:p>
+      <w:pPr>
+        <w:pStyle w:val="FirstParagraph"/>
       </w:pPr>
       <w:r>
         <w:rPr>
@@ -11847,7 +12032,121 @@
         <w:t xml:space="preserve"> </w:t>
       </w:r>
       <w:r>
-        <w:t xml:space="preserve">+</w:t>
+        <w:t xml:space="preserve">→ the transition now</w:t>
+      </w:r>
+      <w:r>
+        <w:t xml:space="preserve"> </w:t>
+      </w:r>
+      <w:r>
+        <w:rPr>
+          <w:bCs/>
+          <w:b/>
+        </w:rPr>
+        <w:t xml:space="preserve">routes through the EM-CFG-04 engine</w:t>
+      </w:r>
+      <w:r>
+        <w:t xml:space="preserve"> </w:t>
+      </w:r>
+      <w:r>
+        <w:t xml:space="preserve">(</w:t>
+      </w:r>
+      <w:r>
+        <w:rPr>
+          <w:rStyle w:val="VerbatimChar"/>
+        </w:rPr>
+        <w:t xml:space="preserve">AccountService</w:t>
+      </w:r>
+      <w:r>
+        <w:t xml:space="preserve"> </w:t>
+      </w:r>
+      <w:r>
+        <w:t xml:space="preserve">raises an</w:t>
+      </w:r>
+      <w:r>
+        <w:t xml:space="preserve"> </w:t>
+      </w:r>
+      <w:r>
+        <w:rPr>
+          <w:rStyle w:val="VerbatimChar"/>
+        </w:rPr>
+        <w:t xml:space="preserve">ApprovalService::request(entity_type=CUSTOMER_SUB_STATUS, action=&lt;code&gt;)</w:t>
+      </w:r>
+      <w:r>
+        <w:t xml:space="preserve">); the change is</w:t>
+      </w:r>
+      <w:r>
+        <w:t xml:space="preserve"> </w:t>
+      </w:r>
+      <w:r>
+        <w:rPr>
+          <w:bCs/>
+          <w:b/>
+        </w:rPr>
+        <w:t xml:space="preserve">held PENDING</w:t>
+      </w:r>
+      <w:r>
+        <w:t xml:space="preserve"> </w:t>
+      </w:r>
+      <w:r>
+        <w:t xml:space="preserve">and</w:t>
+      </w:r>
+      <w:r>
+        <w:t xml:space="preserve"> </w:t>
+      </w:r>
+      <w:r>
+        <w:rPr>
+          <w:rStyle w:val="VerbatimChar"/>
+        </w:rPr>
+        <w:t xml:space="preserve">ApplySubStatusOnApproval</w:t>
+      </w:r>
+      <w:r>
+        <w:t xml:space="preserve"> </w:t>
+      </w:r>
+      <w:r>
+        <w:t xml:space="preserve">applies it on</w:t>
+      </w:r>
+      <w:r>
+        <w:t xml:space="preserve"> </w:t>
+      </w:r>
+      <w:r>
+        <w:rPr>
+          <w:rStyle w:val="VerbatimChar"/>
+        </w:rPr>
+        <w:t xml:space="preserve">ApprovalApproved</w:t>
+      </w:r>
+      <w:r>
+        <w:t xml:space="preserve">. The policy can be a</w:t>
+      </w:r>
+      <w:r>
+        <w:t xml:space="preserve"> </w:t>
+      </w:r>
+      <w:r>
+        <w:rPr>
+          <w:bCs/>
+          <w:b/>
+        </w:rPr>
+        <w:t xml:space="preserve">single approver or a chain</w:t>
+      </w:r>
+      <w:r>
+        <w:t xml:space="preserve"> </w:t>
+      </w:r>
+      <w:r>
+        <w:t xml:space="preserve">— the engine supports both, seeded as one</w:t>
+      </w:r>
+      <w:r>
+        <w:t xml:space="preserve"> </w:t>
+      </w:r>
+      <w:r>
+        <w:rPr>
+          <w:rStyle w:val="VerbatimChar"/>
+        </w:rPr>
+        <w:t xml:space="preserve">CUSTOMER_CARE_SUPERVISOR</w:t>
+      </w:r>
+      <w:r>
+        <w:t xml:space="preserve"> </w:t>
+      </w:r>
+      <w:r>
+        <w:t xml:space="preserve">stage by default.</w:t>
       </w:r>
       <w:r>
         <w:t xml:space="preserve"> </w:t>
@@ -11862,7 +12161,7 @@
         <w:t xml:space="preserve"> </w:t>
       </w:r>
       <w:r>
-        <w:t xml:space="preserve">(which roles may sign).</w:t>
+        <w:t xml:space="preserve">is the advisory list that an operator can use to seed the stage(s).</w:t>
       </w:r>
     </w:p>
     <w:p>
@@ -16667,7 +16966,7 @@
               <a:graphicData uri="http://schemas.openxmlformats.org/drawingml/2006/picture">
                 <pic:pic>
                   <pic:nvPicPr>
-                    <pic:cNvPr descr="/tmp/docximg-dY8fbM/ilm_md_4.png" id="48" name="Picture"/>
+                    <pic:cNvPr descr="/tmp/docximg-qjBMyN/ilm_md_4.png" id="48" name="Picture"/>
                     <pic:cNvPicPr>
                       <a:picLocks noChangeArrowheads="1" noChangeAspect="1"/>
                     </pic:cNvPicPr>

</xml_diff>